<commit_message>
Harden skillcheck, fix review findings in the lesson and exercises
</commit_message>
<xml_diff>
--- a/docs/skills.docx
+++ b/docs/skills.docx
@@ -1000,12 +1000,7 @@
                 <w:szCs w:val="14"/>
                 <w:rtl w:val="0"/>
               </w:rPr>
-              <w:t xml:space="preserve">SKILL.MD</w:t>
-            </w:r>
-            <w:r>
-              <w:rPr>
-                <w:rtl w:val="0"/>
-              </w:rPr>
+              <w:t xml:space="preserve">SKILL.md</w:t>
             </w:r>
           </w:p>
           <w:p>
@@ -2282,12 +2277,7 @@
                 <w:szCs w:val="14"/>
                 <w:rtl w:val="0"/>
               </w:rPr>
-              <w:t xml:space="preserve">~/.CLAUDE/SKILLS/PR-DESCRIPTION/SKILL.MD</w:t>
-            </w:r>
-            <w:r>
-              <w:rPr>
-                <w:rtl w:val="0"/>
-              </w:rPr>
+              <w:t xml:space="preserve">~/.claude/skills/pr-description/SKILL.md</w:t>
             </w:r>
           </w:p>
           <w:p>
@@ -2903,12 +2893,12 @@
           <wp:inline distB="0" distT="0" distL="0" distR="0">
             <wp:extent cx="6443663" cy="3624560"/>
             <wp:effectExtent b="0" l="0" r="0" t="0"/>
-            <wp:docPr descr="After a restart, confirm your new skill appears in the available-skills list." id="11" name="image6.png"/>
+            <wp:docPr descr="Confirm your new skill appears in the available-skills list." id="11" name="image6.png"/>
             <a:graphic>
               <a:graphicData uri="http://schemas.openxmlformats.org/drawingml/2006/picture">
                 <pic:pic>
                   <pic:nvPicPr>
-                    <pic:cNvPr descr="After a restart, confirm your new skill appears in the available-skills list." id="0" name="image6.png"/>
+                    <pic:cNvPr descr="Confirm your new skill appears in the available-skills list." id="0" name="image6.png"/>
                     <pic:cNvPicPr preferRelativeResize="0"/>
                   </pic:nvPicPr>
                   <pic:blipFill>
@@ -3150,14 +3140,14 @@
         <w:rPr/>
         <w:drawing>
           <wp:inline distB="0" distT="0" distL="0" distR="0">
-            <wp:extent cx="6500813" cy="3656707"/>
+            <wp:extent cx="6500813" cy="1755219"/>
             <wp:effectExtent b="0" l="0" r="0" t="0"/>
-            <wp:docPr descr="Claude asks before loading a matched skill, then reads the full SKILL.md and follows it." id="7" name="image9.png"/>
+            <wp:docPr descr="Claude Code can ask before loading a matched skill, then reads the full SKILL.md and follows it." id="7" name="image9.png"/>
             <a:graphic>
               <a:graphicData uri="http://schemas.openxmlformats.org/drawingml/2006/picture">
                 <pic:pic>
                   <pic:nvPicPr>
-                    <pic:cNvPr descr="Claude asks before loading a matched skill, then reads the full SKILL.md and follows it." id="0" name="image9.png"/>
+                    <pic:cNvPr descr="Claude Code can ask before loading a matched skill, then reads the full SKILL.md and follows it." id="0" name="image9.png"/>
                     <pic:cNvPicPr preferRelativeResize="0"/>
                   </pic:nvPicPr>
                   <pic:blipFill>
@@ -3170,7 +3160,7 @@
                   <pic:spPr>
                     <a:xfrm>
                       <a:off x="0" y="0"/>
-                      <a:ext cx="6500813" cy="3656707"/>
+                      <a:ext cx="6500813" cy="1755219"/>
                     </a:xfrm>
                     <a:prstGeom prst="rect"/>
                     <a:ln/>
@@ -3377,8 +3367,14 @@
             </w:pPr>
             <w:r>
               <w:rPr>
-                <w:rtl w:val="0"/>
-              </w:rPr>
+                <w:b w:val="1"/>
+                <w:bCs w:val="1"/>
+                <w:color w:val="201f1c"/>
+                <w:sz w:val="17"/>
+                <w:szCs w:val="17"/>
+                <w:rtl w:val="0"/>
+              </w:rPr>
+              <w:t xml:space="preserve">Typical use</w:t>
             </w:r>
           </w:p>
         </w:tc>
@@ -4100,9 +4096,71 @@
       </w:pPr>
       <w:r>
         <w:rPr>
-          <w:rtl w:val="0"/>
-        </w:rPr>
-        <w:t xml:space="preserve">The Agent Skills standard defines these frontmatter fields - two required, the rest optional. Claude Code is more forgiving (it falls back to the folder name when </w:t>
+          <w:rFonts w:ascii="Courier New" w:cs="Courier New" w:eastAsia="Courier New" w:hAnsi="Courier New"/>
+          <w:color w:val="201f1c"/>
+          <w:sz w:val="20"/>
+          <w:szCs w:val="20"/>
+          <w:shd w:fill="ece6dd" w:val="clear"/>
+          <w:rtl w:val="0"/>
+        </w:rPr>
+        <w:t xml:space="preserve">name</w:t>
+      </w:r>
+      <w:r>
+        <w:rPr>
+          <w:rtl w:val="0"/>
+        </w:rPr>
+        <w:t xml:space="preserve"> and </w:t>
+      </w:r>
+      <w:r>
+        <w:rPr>
+          <w:rFonts w:ascii="Courier New" w:cs="Courier New" w:eastAsia="Courier New" w:hAnsi="Courier New"/>
+          <w:color w:val="201f1c"/>
+          <w:sz w:val="20"/>
+          <w:szCs w:val="20"/>
+          <w:shd w:fill="ece6dd" w:val="clear"/>
+          <w:rtl w:val="0"/>
+        </w:rPr>
+        <w:t xml:space="preserve">description</w:t>
+      </w:r>
+      <w:r>
+        <w:rPr>
+          <w:rtl w:val="0"/>
+        </w:rPr>
+        <w:t xml:space="preserve"> come from the Agent Skills standard and are required there; Claude Code also supports optional fields such as </w:t>
+      </w:r>
+      <w:r>
+        <w:rPr>
+          <w:rFonts w:ascii="Courier New" w:cs="Courier New" w:eastAsia="Courier New" w:hAnsi="Courier New"/>
+          <w:color w:val="201f1c"/>
+          <w:sz w:val="20"/>
+          <w:szCs w:val="20"/>
+          <w:shd w:fill="ece6dd" w:val="clear"/>
+          <w:rtl w:val="0"/>
+        </w:rPr>
+        <w:t xml:space="preserve">allowed-tools</w:t>
+      </w:r>
+      <w:r>
+        <w:rPr>
+          <w:rtl w:val="0"/>
+        </w:rPr>
+        <w:t xml:space="preserve"> and </w:t>
+      </w:r>
+      <w:r>
+        <w:rPr>
+          <w:rFonts w:ascii="Courier New" w:cs="Courier New" w:eastAsia="Courier New" w:hAnsi="Courier New"/>
+          <w:color w:val="201f1c"/>
+          <w:sz w:val="20"/>
+          <w:szCs w:val="20"/>
+          <w:shd w:fill="ece6dd" w:val="clear"/>
+          <w:rtl w:val="0"/>
+        </w:rPr>
+        <w:t xml:space="preserve">model</w:t>
+      </w:r>
+      <w:r>
+        <w:rPr>
+          <w:rtl w:val="0"/>
+        </w:rPr>
+        <w:t xml:space="preserve">. Claude Code is more forgiving than the standard (it falls back to the folder name when </w:t>
       </w:r>
       <w:r>
         <w:rPr>
@@ -4921,12 +4979,7 @@
                 <w:szCs w:val="14"/>
                 <w:rtl w:val="0"/>
               </w:rPr>
-              <w:t xml:space="preserve">SKILL.MD</w:t>
-            </w:r>
-            <w:r>
-              <w:rPr>
-                <w:rtl w:val="0"/>
-              </w:rPr>
+              <w:t xml:space="preserve">SKILL.md</w:t>
             </w:r>
           </w:p>
           <w:p>
@@ -4945,11 +4998,6 @@
               </w:rPr>
               <w:t xml:space="preserve">---</w:t>
             </w:r>
-            <w:r>
-              <w:rPr>
-                <w:rtl w:val="0"/>
-              </w:rPr>
-            </w:r>
           </w:p>
           <w:p>
             <w:pPr>
@@ -4967,11 +5015,6 @@
               </w:rPr>
               <w:t xml:space="preserve">name: codebase-onboarding</w:t>
             </w:r>
-            <w:r>
-              <w:rPr>
-                <w:rtl w:val="0"/>
-              </w:rPr>
-            </w:r>
           </w:p>
           <w:p>
             <w:pPr>
@@ -4989,11 +5032,6 @@
               </w:rPr>
               <w:t xml:space="preserve">description: Helps new developers understand how the system works.</w:t>
             </w:r>
-            <w:r>
-              <w:rPr>
-                <w:rtl w:val="0"/>
-              </w:rPr>
-            </w:r>
           </w:p>
           <w:p>
             <w:pPr>
@@ -5009,12 +5047,7 @@
                 <w:szCs w:val="19"/>
                 <w:rtl w:val="0"/>
               </w:rPr>
-              <w:t xml:space="preserve">allowed-tools: Read, Grep, Glob, Bash</w:t>
-            </w:r>
-            <w:r>
-              <w:rPr>
-                <w:rtl w:val="0"/>
-              </w:rPr>
+              <w:t xml:space="preserve">  Use when a new developer asks how the codebase is organized.</w:t>
             </w:r>
           </w:p>
           <w:p>
@@ -5031,17 +5064,12 @@
                 <w:szCs w:val="19"/>
                 <w:rtl w:val="0"/>
               </w:rPr>
-              <w:t xml:space="preserve">model: sonnet</w:t>
-            </w:r>
-            <w:r>
-              <w:rPr>
-                <w:rtl w:val="0"/>
-              </w:rPr>
-            </w:r>
-          </w:p>
-          <w:p>
-            <w:pPr>
-              <w:spacing w:after="0" w:line="360" w:lineRule="auto"/>
+              <w:t xml:space="preserve">allowed-tools: Read, Grep, Glob, Bash</w:t>
+            </w:r>
+          </w:p>
+          <w:p>
+            <w:pPr>
+              <w:spacing w:after="36" w:line="360" w:lineRule="auto"/>
               <w:jc w:val="both"/>
               <w:rPr/>
             </w:pPr>
@@ -5053,12 +5081,24 @@
                 <w:szCs w:val="19"/>
                 <w:rtl w:val="0"/>
               </w:rPr>
+              <w:t xml:space="preserve">model: sonnet</w:t>
+            </w:r>
+          </w:p>
+          <w:p>
+            <w:pPr>
+              <w:spacing w:after="36" w:line="360" w:lineRule="auto"/>
+              <w:jc w:val="both"/>
+              <w:rPr/>
+            </w:pPr>
+            <w:r>
+              <w:rPr>
+                <w:rFonts w:ascii="Courier New" w:cs="Courier New" w:eastAsia="Courier New" w:hAnsi="Courier New"/>
+                <w:color w:val="2b2a27"/>
+                <w:sz w:val="19"/>
+                <w:szCs w:val="19"/>
+                <w:rtl w:val="0"/>
+              </w:rPr>
               <w:t xml:space="preserve">---</w:t>
-            </w:r>
-            <w:r>
-              <w:rPr>
-                <w:rtl w:val="0"/>
-              </w:rPr>
             </w:r>
           </w:p>
         </w:tc>
@@ -5100,12 +5140,12 @@
           <wp:inline distB="0" distT="0" distL="0" distR="0">
             <wp:extent cx="6510338" cy="3662065"/>
             <wp:effectExtent b="0" l="0" r="0" t="0"/>
-            <wp:docPr descr="With allowed-tools set, the skill is limited to read-only tools while it’s active." id="8" name="image8.png"/>
+            <wp:docPr descr="With allowed-tools set, the listed tools are pre-approved while the skill is active." id="8" name="image8.png"/>
             <a:graphic>
               <a:graphicData uri="http://schemas.openxmlformats.org/drawingml/2006/picture">
                 <pic:pic>
                   <pic:nvPicPr>
-                    <pic:cNvPr descr="With allowed-tools set, the skill is limited to read-only tools while it’s active." id="0" name="image8.png"/>
+                    <pic:cNvPr descr="With allowed-tools set, the listed tools are pre-approved while the skill is active." id="0" name="image8.png"/>
                     <pic:cNvPicPr preferRelativeResize="0"/>
                   </pic:nvPicPr>
                   <pic:blipFill>
@@ -6462,12 +6502,7 @@
                 <w:szCs w:val="20"/>
                 <w:rtl w:val="0"/>
               </w:rPr>
-              <w:t xml:space="preserve">On events (saves, tool calls)</w:t>
-            </w:r>
-            <w:r>
-              <w:rPr>
-                <w:rtl w:val="0"/>
-              </w:rPr>
+              <w:t xml:space="preserve">On events (tool calls, session start)</w:t>
             </w:r>
           </w:p>
         </w:tc>
@@ -6713,7 +6748,7 @@
         <w:rPr>
           <w:rtl w:val="0"/>
         </w:rPr>
-        <w:t xml:space="preserve"> for operations that should run on every file save or before specific tool calls. And use </w:t>
+        <w:t xml:space="preserve"> for operations that should run automatically on events, such as after every file edit or before specific tool calls. And use </w:t>
       </w:r>
       <w:r>
         <w:rPr>
@@ -7048,7 +7083,7 @@
         <w:rPr>
           <w:rtl w:val="0"/>
         </w:rPr>
-        <w:t xml:space="preserve">. Enterprise skills take the highest priority - they override personal, project, and plugin skills of the same name. The managed-settings file also supports </w:t>
+        <w:t xml:space="preserve">. Enterprise skills take the highest priority - they override personal and project skills of the same name. The managed-settings file also supports </w:t>
       </w:r>
       <w:r>
         <w:rPr>
@@ -7323,7 +7358,7 @@
         </w:rPr>
         <w:drawing>
           <wp:inline distB="0" distT="0" distL="0" distR="0">
-            <wp:extent cx="6500813" cy="2358576"/>
+            <wp:extent cx="6500813" cy="767908"/>
             <wp:effectExtent b="0" l="0" r="0" t="0"/>
             <wp:docPr descr="Enterprise managed settings deploy skills organization-wide at the highest priority." id="6" name="image3.png"/>
             <a:graphic>
@@ -7343,7 +7378,7 @@
                   <pic:spPr>
                     <a:xfrm>
                       <a:off x="0" y="0"/>
-                      <a:ext cx="6500813" cy="2358576"/>
+                      <a:ext cx="6500813" cy="767908"/>
                     </a:xfrm>
                     <a:prstGeom prst="rect"/>
                     <a:ln/>
@@ -7742,7 +7777,7 @@
         <w:rPr>
           <w:rtl w:val="0"/>
         </w:rPr>
-        <w:t xml:space="preserve"> (personal), or ask Claude to write one for you. Claude Code picks up new and edited agent files within a few seconds. Here is a read-only reviewer for machine-learning evaluation code that preloads the </w:t>
+        <w:t xml:space="preserve"> (personal), or ask Claude to write one for you. Claude Code picks up new and edited agent files within a few seconds (restart it if the agents folder itself is new). Here is a read-only reviewer for machine-learning evaluation code that preloads the </w:t>
       </w:r>
       <w:r>
         <w:rPr>
@@ -7820,7 +7855,7 @@
                 <w:szCs w:val="14"/>
                 <w:rtl w:val="0"/>
               </w:rPr>
-              <w:t xml:space="preserve">~/.CLAUDE/AGENTS/MODEL-EVAL-REVIEWER.MD</w:t>
+              <w:t xml:space="preserve">~/.claude/agents/model-eval-reviewer.md</w:t>
             </w:r>
           </w:p>
           <w:p>
@@ -8410,7 +8445,7 @@
         <w:rPr>
           <w:rtl w:val="0"/>
         </w:rPr>
-        <w:t xml:space="preserve">Almost always the description. Claude uses semantic matching, so your request must overlap with the description’s meaning. Check it against how you actually phrase requests, add trigger phrases users would say, and test variations like “help me profile this,” “why is this slow?”, “make this faster.” If any variation fails, add those keywords.</w:t>
+        <w:t xml:space="preserve">Almost always the description. Claude uses semantic matching, so your request must overlap with the description’s meaning. Check it against how you actually phrase requests, add trigger phrases users would say, and test variations like “review my evaluation,” “can I trust this accuracy?”, “check my metrics.” If any variation fails, add those keywords.</w:t>
       </w:r>
     </w:p>
     <w:p>
@@ -9741,7 +9776,7 @@
                 <w:szCs w:val="18"/>
                 <w:rtl w:val="0"/>
               </w:rPr>
-              <w:t xml:space="preserve">python3 -m venv .venv &amp;&amp; source .venv/bin/activate</w:t>
+              <w:t xml:space="preserve">python3 -m venv .venv</w:t>
             </w:r>
           </w:p>
           <w:p>
@@ -9757,7 +9792,39 @@
                 <w:szCs w:val="18"/>
                 <w:rtl w:val="0"/>
               </w:rPr>
+              <w:t xml:space="preserve">source .venv/bin/activate    # Windows: .venv\Scripts\activate</w:t>
+            </w:r>
+          </w:p>
+          <w:p>
+            <w:pPr>
+              <w:spacing w:after="0" w:line="360" w:lineRule="auto"/>
+              <w:jc w:val="both"/>
+              <w:rPr/>
+            </w:pPr>
+            <w:r>
+              <w:rPr>
+                <w:rFonts w:ascii="Courier New" w:cs="Courier New" w:eastAsia="Courier New" w:hAnsi="Courier New"/>
+                <w:sz w:val="18"/>
+                <w:szCs w:val="18"/>
+                <w:rtl w:val="0"/>
+              </w:rPr>
               <w:t xml:space="preserve">pip install -e ".[dev]"</w:t>
+            </w:r>
+          </w:p>
+          <w:p>
+            <w:pPr>
+              <w:spacing w:after="0" w:line="360" w:lineRule="auto"/>
+              <w:jc w:val="both"/>
+              <w:rPr/>
+            </w:pPr>
+            <w:r>
+              <w:rPr>
+                <w:rFonts w:ascii="Courier New" w:cs="Courier New" w:eastAsia="Courier New" w:hAnsi="Courier New"/>
+                <w:sz w:val="18"/>
+                <w:szCs w:val="18"/>
+                <w:rtl w:val="0"/>
+              </w:rPr>
+              <w:t xml:space="preserve">pytest</w:t>
             </w:r>
           </w:p>
         </w:tc>
@@ -13241,6 +13308,91 @@
           </w:p>
         </w:tc>
       </w:tr>
+      <w:tr>
+        <w:trPr>
+          <w:cantSplit w:val="0"/>
+          <w:tblHeader w:val="0"/>
+        </w:trPr>
+        <w:tc>
+          <w:tcPr>
+            <w:tcBorders>
+              <w:top w:color="e1d9ce" w:space="0" w:sz="4" w:val="single"/>
+              <w:left w:color="e1d9ce" w:space="0" w:sz="4" w:val="single"/>
+              <w:bottom w:color="e1d9ce" w:space="0" w:sz="4" w:val="single"/>
+              <w:right w:color="e1d9ce" w:space="0" w:sz="4" w:val="single"/>
+            </w:tcBorders>
+            <w:shd w:fill="ffffff" w:val="clear"/>
+            <w:tcMar>
+              <w:top w:w="100.0" w:type="dxa"/>
+              <w:left w:w="160.0" w:type="dxa"/>
+              <w:bottom w:w="100.0" w:type="dxa"/>
+              <w:right w:w="160.0" w:type="dxa"/>
+            </w:tcMar>
+          </w:tcPr>
+          <w:p>
+            <w:pPr>
+              <w:spacing w:after="0" w:line="360" w:lineRule="auto"/>
+              <w:jc w:val="both"/>
+              <w:rPr/>
+            </w:pPr>
+            <w:r>
+              <w:rPr>
+                <w:b w:val="1"/>
+                <w:bCs w:val="1"/>
+                <w:rtl w:val="0"/>
+              </w:rPr>
+              <w:t xml:space="preserve">test_teaching_sample.py fails</w:t>
+            </w:r>
+          </w:p>
+        </w:tc>
+        <w:tc>
+          <w:tcPr>
+            <w:tcBorders>
+              <w:top w:color="e1d9ce" w:space="0" w:sz="4" w:val="single"/>
+              <w:left w:color="e1d9ce" w:space="0" w:sz="4" w:val="single"/>
+              <w:bottom w:color="e1d9ce" w:space="0" w:sz="4" w:val="single"/>
+              <w:right w:color="e1d9ce" w:space="0" w:sz="4" w:val="single"/>
+            </w:tcBorders>
+            <w:shd w:fill="ffffff" w:val="clear"/>
+            <w:tcMar>
+              <w:top w:w="100.0" w:type="dxa"/>
+              <w:left w:w="160.0" w:type="dxa"/>
+              <w:bottom w:w="100.0" w:type="dxa"/>
+              <w:right w:w="160.0" w:type="dxa"/>
+            </w:tcMar>
+          </w:tcPr>
+          <w:p>
+            <w:pPr>
+              <w:spacing w:after="0" w:line="360" w:lineRule="auto"/>
+              <w:jc w:val="both"/>
+              <w:rPr/>
+            </w:pPr>
+            <w:r>
+              <w:rPr>
+                <w:rtl w:val="0"/>
+              </w:rPr>
+              <w:t xml:space="preserve">The sample was changed. Restore it with </w:t>
+            </w:r>
+            <w:r>
+              <w:rPr>
+                <w:rFonts w:ascii="Courier New" w:cs="Courier New" w:eastAsia="Courier New" w:hAnsi="Courier New"/>
+                <w:color w:val="201f1c"/>
+                <w:sz w:val="20"/>
+                <w:szCs w:val="20"/>
+                <w:shd w:fill="ece6dd" w:val="clear"/>
+                <w:rtl w:val="0"/>
+              </w:rPr>
+              <w:t xml:space="preserve">git checkout -- src/failure_model/evaluate.py</w:t>
+            </w:r>
+            <w:r>
+              <w:rPr>
+                <w:rtl w:val="0"/>
+              </w:rPr>
+              <w:t xml:space="preserve">.</w:t>
+            </w:r>
+          </w:p>
+        </w:tc>
+      </w:tr>
     </w:tbl>
     <w:p>
       <w:pPr>
@@ -13541,7 +13693,7 @@
         <w:szCs w:val="16"/>
         <w:rtl w:val="0"/>
       </w:rPr>
-      <w:t xml:space="preserve">Anthropic · Claude CodePage </w:t>
+      <w:t xml:space="preserve">Claude Code Skills  ·  Page </w:t>
     </w:r>
     <w:r>
       <w:rPr>
@@ -13582,7 +13734,7 @@
         <w:szCs w:val="16"/>
         <w:rtl w:val="0"/>
       </w:rPr>
-      <w:t xml:space="preserve">Anthropic · Claude CodePage </w:t>
+      <w:t xml:space="preserve">Claude Code Skills  ·  Page </w:t>
     </w:r>
     <w:r>
       <w:rPr>

</xml_diff>

<commit_message>
Handle unreadable folders and relative paths in skillcheck, correct reload guidance, tidy lesson images
</commit_message>
<xml_diff>
--- a/docs/skills.docx
+++ b/docs/skills.docx
@@ -1517,7 +1517,7 @@
         <w:rPr/>
         <w:drawing>
           <wp:inline distB="0" distT="0" distL="0" distR="0">
-            <wp:extent cx="6538913" cy="3678138"/>
+            <wp:extent cx="6198889" cy="3678138"/>
             <wp:effectExtent b="0" l="0" r="0" t="0"/>
             <wp:docPr descr="When a skill matches your request, you’ll see it load in the terminal." id="10" name="image10.png"/>
             <a:graphic>
@@ -1537,7 +1537,7 @@
                   <pic:spPr>
                     <a:xfrm>
                       <a:off x="0" y="0"/>
-                      <a:ext cx="6538913" cy="3678138"/>
+                      <a:ext cx="6198889" cy="3678138"/>
                     </a:xfrm>
                     <a:prstGeom prst="rect"/>
                     <a:ln/>
@@ -2855,7 +2855,7 @@
         <w:rPr>
           <w:rtl w:val="0"/>
         </w:rPr>
-        <w:t xml:space="preserve">Claude Code watches your skills folders, so a new or edited skill is picked up without a restart. If the skills folder itself did not exist when your session started, run </w:t>
+        <w:t xml:space="preserve">Claude Code watches your skills folders, so a new or edited skill is picked up without a restart. If the skills folder itself did not exist when your session started, restart Claude Code so it starts watching the new folder (</w:t>
       </w:r>
       <w:r>
         <w:rPr>
@@ -2872,7 +2872,7 @@
         <w:rPr>
           <w:rtl w:val="0"/>
         </w:rPr>
-        <w:t xml:space="preserve"> (or restart). Then verify the skill by checking the available-skills list.</w:t>
+        <w:t xml:space="preserve"> loads it too, but must be run again after every later edit). Then verify the skill by checking the available-skills list.</w:t>
       </w:r>
     </w:p>
     <w:p>
@@ -2891,7 +2891,7 @@
         <w:rPr/>
         <w:drawing>
           <wp:inline distB="0" distT="0" distL="0" distR="0">
-            <wp:extent cx="6443663" cy="3624560"/>
+            <wp:extent cx="5348240" cy="3443332"/>
             <wp:effectExtent b="0" l="0" r="0" t="0"/>
             <wp:docPr descr="Confirm your new skill appears in the available-skills list." id="11" name="image6.png"/>
             <a:graphic>
@@ -2911,7 +2911,7 @@
                   <pic:spPr>
                     <a:xfrm>
                       <a:off x="0" y="0"/>
-                      <a:ext cx="6443663" cy="3624560"/>
+                      <a:ext cx="5348240" cy="3443332"/>
                     </a:xfrm>
                     <a:prstGeom prst="rect"/>
                     <a:ln/>
@@ -3005,24 +3005,7 @@
         <w:rPr>
           <w:rtl w:val="0"/>
         </w:rPr>
-        <w:t xml:space="preserve">. To remove one, delete its directory. Changes are picked up during the session; if one is not, run </w:t>
-      </w:r>
-      <w:r>
-        <w:rPr>
-          <w:rFonts w:ascii="Courier New" w:cs="Courier New" w:eastAsia="Courier New" w:hAnsi="Courier New"/>
-          <w:color w:val="201f1c"/>
-          <w:sz w:val="20"/>
-          <w:szCs w:val="20"/>
-          <w:shd w:fill="ece6dd" w:val="clear"/>
-          <w:rtl w:val="0"/>
-        </w:rPr>
-        <w:t xml:space="preserve">/reload-skills</w:t>
-      </w:r>
-      <w:r>
-        <w:rPr>
-          <w:rtl w:val="0"/>
-        </w:rPr>
-        <w:t xml:space="preserve"> or restart Claude Code.</w:t>
+        <w:t xml:space="preserve">. To remove one, delete its directory. Changes are picked up during the session; if one is not, restart Claude Code.</w:t>
       </w:r>
     </w:p>
     <w:bookmarkStart w:colFirst="0" w:colLast="0" w:name="kix.w3rr8nm53fzb" w:id="4"/>
@@ -3875,12 +3858,7 @@
                 <w:szCs w:val="20"/>
                 <w:rtl w:val="0"/>
               </w:rPr>
-              <w:t xml:space="preserve">Community</w:t>
-            </w:r>
-            <w:r>
-              <w:rPr>
-                <w:rtl w:val="0"/>
-              </w:rPr>
+              <w:t xml:space="preserve">Namespaced, so no clash</w:t>
             </w:r>
           </w:p>
         </w:tc>
@@ -5138,7 +5116,7 @@
         <w:rPr/>
         <w:drawing>
           <wp:inline distB="0" distT="0" distL="0" distR="0">
-            <wp:extent cx="6510338" cy="3662065"/>
+            <wp:extent cx="6510338" cy="3533892"/>
             <wp:effectExtent b="0" l="0" r="0" t="0"/>
             <wp:docPr descr="With allowed-tools set, the listed tools are pre-approved while the skill is active." id="8" name="image8.png"/>
             <a:graphic>
@@ -5158,7 +5136,7 @@
                   <pic:spPr>
                     <a:xfrm>
                       <a:off x="0" y="0"/>
-                      <a:ext cx="6510338" cy="3662065"/>
+                      <a:ext cx="6510338" cy="3533892"/>
                     </a:xfrm>
                     <a:prstGeom prst="rect"/>
                     <a:ln/>
@@ -6979,7 +6957,7 @@
         <w:rPr/>
         <w:drawing>
           <wp:inline distB="0" distT="0" distL="0" distR="0">
-            <wp:extent cx="6529388" cy="2240395"/>
+            <wp:extent cx="6529388" cy="2144903"/>
             <wp:effectExtent b="0" l="0" r="0" t="0"/>
             <wp:docPr descr="Distribute skills as a plugin so others can install them from a marketplace." id="2" name="image1.png"/>
             <a:graphic>
@@ -6999,7 +6977,7 @@
                   <pic:spPr>
                     <a:xfrm>
                       <a:off x="0" y="0"/>
-                      <a:ext cx="6529388" cy="2240395"/>
+                      <a:ext cx="6529388" cy="2144903"/>
                     </a:xfrm>
                     <a:prstGeom prst="rect"/>
                     <a:ln/>
@@ -10907,24 +10885,7 @@
         <w:rPr>
           <w:rtl w:val="0"/>
         </w:rPr>
-        <w:t xml:space="preserve">, run </w:t>
-      </w:r>
-      <w:r>
-        <w:rPr>
-          <w:rFonts w:ascii="Courier New" w:cs="Courier New" w:eastAsia="Courier New" w:hAnsi="Courier New"/>
-          <w:color w:val="201f1c"/>
-          <w:sz w:val="20"/>
-          <w:szCs w:val="20"/>
-          <w:shd w:fill="ece6dd" w:val="clear"/>
-          <w:rtl w:val="0"/>
-        </w:rPr>
-        <w:t xml:space="preserve">/reload-skills</w:t>
-      </w:r>
-      <w:r>
-        <w:rPr>
-          <w:rtl w:val="0"/>
-        </w:rPr>
-        <w:t xml:space="preserve"> first. Then confirm the Skill is registered:</w:t>
+        <w:t xml:space="preserve">, restart it first. Then confirm the Skill is registered:</w:t>
       </w:r>
     </w:p>
     <w:tbl>
@@ -13184,7 +13145,7 @@
               <w:rPr>
                 <w:rtl w:val="0"/>
               </w:rPr>
-              <w:t xml:space="preserve">Run </w:t>
+              <w:t xml:space="preserve">Restart Claude Code. A skills folder created after the session started is only watched after a restart; </w:t>
             </w:r>
             <w:r>
               <w:rPr>
@@ -13201,7 +13162,7 @@
               <w:rPr>
                 <w:rtl w:val="0"/>
               </w:rPr>
-              <w:t xml:space="preserve">, or restart Claude Code. A skills folder created after the session started is not watched until you do.</w:t>
+              <w:t xml:space="preserve"> picks up the current version but must be run again after each later edit.</w:t>
             </w:r>
           </w:p>
         </w:tc>

</xml_diff>